<commit_message>
feat: cap nhat bao cao tuan theo form mau moi voi modal tu hoan thien truoc khi xuat docx
</commit_message>
<xml_diff>
--- a/backend/src/main/resources/templates/weekly_report_template.docx
+++ b/backend/src/main/resources/templates/weekly_report_template.docx
@@ -1,6 +1,6 @@
 
 <file path=word/document.xml><?xml version="1.0" encoding="utf-8"?>
-<w:document xmlns:wpc="http://schemas.microsoft.com/office/word/2010/wordprocessingCanvas" xmlns:cx="http://schemas.microsoft.com/office/drawing/2014/chartex" xmlns:cx1="http://schemas.microsoft.com/office/drawing/2015/9/8/chartex" xmlns:cx2="http://schemas.microsoft.com/office/drawing/2015/10/21/chartex" xmlns:cx3="http://schemas.microsoft.com/office/drawing/2016/5/9/chartex" xmlns:cx4="http://schemas.microsoft.com/office/drawing/2016/5/10/chartex" xmlns:cx5="http://schemas.microsoft.com/office/drawing/2016/5/11/chartex" xmlns:cx6="http://schemas.microsoft.com/office/drawing/2016/5/12/chartex" xmlns:cx7="http://schemas.microsoft.com/office/drawing/2016/5/13/chartex" xmlns:cx8="http://schemas.microsoft.com/office/drawing/2016/5/14/chartex" xmlns:mc="http://schemas.openxmlformats.org/markup-compatibility/2006" xmlns:aink="http://schemas.microsoft.com/office/drawing/2016/ink" xmlns:am3d="http://schemas.microsoft.com/office/drawing/2017/model3d" xmlns:o="urn:schemas-microsoft-com:office:office" xmlns:oel="http://schemas.microsoft.com/office/2019/extlst" xmlns:r="http://schemas.openxmlformats.org/officeDocument/2006/relationships" xmlns:m="http://schemas.openxmlformats.org/officeDocument/2006/math" xmlns:v="urn:schemas-microsoft-com:vml" xmlns:wp14="http://schemas.microsoft.com/office/word/2010/wordprocessingDrawing" xmlns:wp="http://schemas.openxmlformats.org/drawingml/2006/wordprocessingDrawing" xmlns:w10="urn:schemas-microsoft-com:office:word" xmlns:w="http://schemas.openxmlformats.org/wordprocessingml/2006/main" xmlns:w14="http://schemas.microsoft.com/office/word/2010/wordml" xmlns:w15="http://schemas.microsoft.com/office/word/2012/wordml" xmlns:w16cei="http://schemas.microsoft.com/office/word/2026/wordml/cei" xmlns:w16cex="http://schemas.microsoft.com/office/word/2018/wordml/cex" xmlns:w16cid="http://schemas.microsoft.com/office/word/2016/wordml/cid" xmlns:w16="http://schemas.microsoft.com/office/word/2018/wordml" xmlns:w16du="http://schemas.microsoft.com/office/word/2023/wordml/word16du" xmlns:w16sdtdh="http://schemas.microsoft.com/office/word/2020/wordml/sdtdatahash" xmlns:w16sdtfl="http://schemas.microsoft.com/office/word/2024/wordml/sdtformatlock" xmlns:w16se="http://schemas.microsoft.com/office/word/2015/wordml/symex" xmlns:wpg="http://schemas.microsoft.com/office/word/2010/wordprocessingGroup" xmlns:wpi="http://schemas.microsoft.com/office/word/2010/wordprocessingInk" xmlns:wne="http://schemas.microsoft.com/office/word/2006/wordml" xmlns:wps="http://schemas.microsoft.com/office/word/2010/wordprocessingShape" mc:Ignorable="w14 w15 w16se w16cid w16 w16cex w16sdtdh w16sdtfl w16du wp14">
+<w:document xmlns:wpc="http://schemas.microsoft.com/office/word/2010/wordprocessingCanvas" xmlns:cx="http://schemas.microsoft.com/office/drawing/2014/chartex" xmlns:cx1="http://schemas.microsoft.com/office/drawing/2015/9/8/chartex" xmlns:cx2="http://schemas.microsoft.com/office/drawing/2015/10/21/chartex" xmlns:cx3="http://schemas.microsoft.com/office/drawing/2016/5/9/chartex" xmlns:cx4="http://schemas.microsoft.com/office/drawing/2016/5/10/chartex" xmlns:cx5="http://schemas.microsoft.com/office/drawing/2016/5/11/chartex" xmlns:cx6="http://schemas.microsoft.com/office/drawing/2016/5/12/chartex" xmlns:cx7="http://schemas.microsoft.com/office/drawing/2016/5/13/chartex" xmlns:cx8="http://schemas.microsoft.com/office/drawing/2016/5/14/chartex" xmlns:mc="http://schemas.openxmlformats.org/markup-compatibility/2006" xmlns:aink="http://schemas.microsoft.com/office/drawing/2016/ink" xmlns:am3d="http://schemas.microsoft.com/office/drawing/2017/model3d" xmlns:o="urn:schemas-microsoft-com:office:office" xmlns:oel="http://schemas.microsoft.com/office/2019/extlst" xmlns:r="http://schemas.openxmlformats.org/officeDocument/2006/relationships" xmlns:m="http://schemas.openxmlformats.org/officeDocument/2006/math" xmlns:v="urn:schemas-microsoft-com:vml" xmlns:wp14="http://schemas.microsoft.com/office/word/2010/wordprocessingDrawing" xmlns:wp="http://schemas.openxmlformats.org/drawingml/2006/wordprocessingDrawing" xmlns:w10="urn:schemas-microsoft-com:office:word" xmlns:w="http://schemas.openxmlformats.org/wordprocessingml/2006/main" xmlns:w14="http://schemas.microsoft.com/office/word/2010/wordml" xmlns:w15="http://schemas.microsoft.com/office/word/2012/wordml" xmlns:w16cex="http://schemas.microsoft.com/office/word/2018/wordml/cex" xmlns:w16cid="http://schemas.microsoft.com/office/word/2016/wordml/cid" xmlns:w16="http://schemas.microsoft.com/office/word/2018/wordml" xmlns:w16du="http://schemas.microsoft.com/office/word/2023/wordml/word16du" xmlns:w16sdtdh="http://schemas.microsoft.com/office/word/2020/wordml/sdtdatahash" xmlns:w16sdtfl="http://schemas.microsoft.com/office/word/2024/wordml/sdtformatlock" xmlns:w16se="http://schemas.microsoft.com/office/word/2015/wordml/symex" xmlns:wpg="http://schemas.microsoft.com/office/word/2010/wordprocessingGroup" xmlns:wpi="http://schemas.microsoft.com/office/word/2010/wordprocessingInk" xmlns:wne="http://schemas.microsoft.com/office/word/2006/wordml" xmlns:wps="http://schemas.microsoft.com/office/word/2010/wordprocessingShape" mc:Ignorable="w14 w15 w16se w16cid w16 w16cex w16sdtdh w16sdtfl w16du wp14">
   <w:body>
     <w:p>
       <w:pPr>
@@ -63,55 +63,52 @@
       <w:r>
         <w:t>I. THÔNG TIN CHUNG</w:t>
       </w:r>
-    </w:p>
-    <w:p>
-      <w:r>
-        <w:rPr>
-          <w:b/>
-          <w:bCs/>
-        </w:rPr>
-        <w:t>Giáo viên:</w:t>
-      </w:r>
-      <w:r>
-        <w:t xml:space="preserve"> </w:t>
-      </w:r>
-      <w:r>
-        <w:t>Trương Minh Tiến</w:t>
-      </w:r>
-      <w:r>
-        <w:tab/>
-      </w:r>
-      <w:r>
-        <w:rPr>
-          <w:b/>
-          <w:bCs/>
-        </w:rPr>
-        <w:t>Tuần:</w:t>
-      </w:r>
-      <w:r>
-        <w:t xml:space="preserve"> </w:t>
-      </w:r>
-      <w:r>
-        <w:t>5</w:t>
-      </w:r>
-      <w:r>
-        <w:t xml:space="preserve"> </w:t>
-      </w:r>
-      <w:r>
-        <w:tab/>
-      </w:r>
-      <w:r>
-        <w:rPr>
-          <w:b/>
-          <w:bCs/>
-        </w:rPr>
-        <w:t>Lớp:</w:t>
-      </w:r>
-      <w:r>
-        <w:t xml:space="preserve"> </w:t>
-      </w:r>
-      <w:r>
-        <w:t>Pre-IELTS</w:t>
+      <w:r>
+        <w:t xml:space="preserve"> (máy làm)</w:t>
+      </w:r>
+    </w:p>
+    <w:p>
+      <w:r>
+        <w:rPr>
+          <w:b/>
+          <w:bCs/>
+        </w:rPr>
+        <w:t xml:space="preserve">Giáo viên: </w:t>
+      </w:r>
+      <w:r>
+        <w:rPr>
+          <w:b/>
+          <w:bCs/>
+        </w:rPr>
+        <w:t>name giáo viên</w:t>
+      </w:r>
+      <w:r>
+        <w:rPr>
+          <w:b/>
+          <w:bCs/>
+        </w:rPr>
+        <w:t xml:space="preserve">    Tuần: </w:t>
+      </w:r>
+      <w:r>
+        <w:rPr>
+          <w:b/>
+          <w:bCs/>
+        </w:rPr>
+        <w:t>ngày x – ngày y</w:t>
+      </w:r>
+      <w:r>
+        <w:rPr>
+          <w:b/>
+          <w:bCs/>
+        </w:rPr>
+        <w:t xml:space="preserve">    Lớp: </w:t>
+      </w:r>
+      <w:r>
+        <w:rPr>
+          <w:b/>
+          <w:bCs/>
+        </w:rPr>
+        <w:t>z</w:t>
       </w:r>
     </w:p>
     <w:p>
@@ -157,16 +154,20 @@
         </w:rPr>
         <w:t>Nội dung đã hoàn thành</w:t>
       </w:r>
-    </w:p>
-    <w:p>
-      <w:r>
-        <w:rPr>
-          <w:highlight w:val="yellow"/>
-        </w:rPr>
-        <w:t>☐</w:t>
-      </w:r>
-      <w:r>
-        <w:t xml:space="preserve"> Hoàn thành đúng tiến độ</w:t>
+      <w:r>
+        <w:rPr>
+          <w:b/>
+          <w:bCs/>
+          <w:color w:val="000000"/>
+          <w:sz w:val="26"/>
+          <w:szCs w:val="26"/>
+        </w:rPr>
+        <w:t xml:space="preserve"> (tôi làm)</w:t>
+      </w:r>
+    </w:p>
+    <w:p>
+      <w:r>
+        <w:t>☐ Hoàn thành đúng tiến độ</w:t>
       </w:r>
       <w:r>
         <w:tab/>
@@ -223,6 +224,16 @@
         </w:rPr>
         <w:t>Bài đã dạy</w:t>
       </w:r>
+      <w:r>
+        <w:rPr>
+          <w:b/>
+          <w:bCs/>
+          <w:color w:val="000000"/>
+          <w:sz w:val="26"/>
+          <w:szCs w:val="26"/>
+        </w:rPr>
+        <w:t xml:space="preserve"> (máy làm)</w:t>
+      </w:r>
     </w:p>
     <w:p>
       <w:pPr>
@@ -231,8 +242,6 @@
         <w:keepLines w:val="0"/>
         <w:spacing w:before="0"/>
         <w:rPr>
-          <w:b/>
-          <w:bCs/>
           <w:color w:val="000000"/>
           <w:sz w:val="26"/>
           <w:szCs w:val="26"/>
@@ -242,93 +251,16 @@
       <w:bookmarkEnd w:id="7"/>
       <w:r>
         <w:rPr>
-          <w:b/>
-          <w:bCs/>
           <w:color w:val="000000"/>
           <w:sz w:val="26"/>
           <w:szCs w:val="26"/>
         </w:rPr>
-        <w:t>1. READING: TRUE-FALSE-NOT GIVEN, Ôn tập matching name</w:t>
-      </w:r>
-    </w:p>
-    <w:p>
-      <w:pPr>
-        <w:rPr>
-          <w:b/>
-          <w:bCs/>
-        </w:rPr>
-      </w:pPr>
-      <w:r>
-        <w:rPr>
-          <w:b/>
-          <w:bCs/>
-        </w:rPr>
-        <w:t>2. WRITING</w:t>
-      </w:r>
-      <w:r>
-        <w:rPr>
-          <w:b/>
-          <w:bCs/>
-        </w:rPr>
-        <w:t>: Writing task 2, cấu trúc, cách viết Introduction.</w:t>
-      </w:r>
-    </w:p>
-    <w:p>
-      <w:pPr>
-        <w:rPr>
-          <w:b/>
-          <w:bCs/>
-        </w:rPr>
-      </w:pPr>
-      <w:r>
-        <w:rPr>
-          <w:b/>
-          <w:bCs/>
-        </w:rPr>
-        <w:t>3. LISTENING</w:t>
-      </w:r>
-      <w:r>
-        <w:rPr>
-          <w:b/>
-          <w:bCs/>
-        </w:rPr>
-        <w:t xml:space="preserve">: </w:t>
-      </w:r>
-      <w:r>
-        <w:rPr>
-          <w:b/>
-          <w:bCs/>
-        </w:rPr>
-        <w:t>Flow-chart labelling, ôn tập SAQ và Map labelling</w:t>
-      </w:r>
-    </w:p>
-    <w:p>
-      <w:pPr>
-        <w:rPr>
-          <w:b/>
-          <w:bCs/>
-        </w:rPr>
-      </w:pPr>
-      <w:r>
-        <w:rPr>
-          <w:b/>
-          <w:bCs/>
-        </w:rPr>
-        <w:t>4. SPEAKING</w:t>
-      </w:r>
-      <w:r>
-        <w:rPr>
-          <w:b/>
-          <w:bCs/>
-        </w:rPr>
-        <w:t>:</w:t>
-      </w:r>
-      <w:r>
-        <w:rPr>
-          <w:b/>
-          <w:bCs/>
-        </w:rPr>
-        <w:t xml:space="preserve"> Speaking chủ đề Sport, ôn dạng câu hỏi Yes/no</w:t>
+        <w:t xml:space="preserve">Buổi 1: ngày + tên buổi học </w:t>
+      </w:r>
+    </w:p>
+    <w:p>
+      <w:r>
+        <w:t>Buổi 2: ngày + tên buổi học</w:t>
       </w:r>
     </w:p>
     <w:p>
@@ -355,6 +287,26 @@
         </w:rPr>
         <w:t>Kế hoạch tuần tới</w:t>
       </w:r>
+      <w:r>
+        <w:rPr>
+          <w:b/>
+          <w:bCs/>
+          <w:color w:val="000000"/>
+          <w:sz w:val="26"/>
+          <w:szCs w:val="26"/>
+        </w:rPr>
+        <w:t xml:space="preserve"> </w:t>
+      </w:r>
+      <w:r>
+        <w:rPr>
+          <w:b/>
+          <w:bCs/>
+          <w:color w:val="000000"/>
+          <w:sz w:val="26"/>
+          <w:szCs w:val="26"/>
+        </w:rPr>
+        <w:t>(máy làm)</w:t>
+      </w:r>
     </w:p>
     <w:p>
       <w:pPr>
@@ -363,271 +315,59 @@
         <w:keepLines w:val="0"/>
         <w:spacing w:before="0"/>
         <w:rPr>
-          <w:b/>
-          <w:bCs/>
           <w:color w:val="000000"/>
           <w:sz w:val="26"/>
           <w:szCs w:val="26"/>
         </w:rPr>
       </w:pPr>
-      <w:r>
-        <w:rPr>
-          <w:b/>
-          <w:bCs/>
+      <w:bookmarkStart w:id="8" w:name="_va5mrd402v46" w:colFirst="0" w:colLast="0"/>
+      <w:bookmarkEnd w:id="8"/>
+      <w:r>
+        <w:rPr>
           <w:color w:val="000000"/>
           <w:sz w:val="26"/>
           <w:szCs w:val="26"/>
         </w:rPr>
-        <w:t xml:space="preserve">1. READING: </w:t>
-      </w:r>
-      <w:r>
-        <w:rPr>
-          <w:b/>
-          <w:bCs/>
+        <w:t xml:space="preserve">Buổi 1: ngày + tên buổi học </w:t>
+      </w:r>
+    </w:p>
+    <w:p>
+      <w:r>
+        <w:t>Buổi 2: ngày + tên buổi học</w:t>
+      </w:r>
+    </w:p>
+    <w:p>
+      <w:pPr>
+        <w:pStyle w:val="Heading2"/>
+      </w:pPr>
+      <w:r>
+        <w:t>III. TÌNH HÌNH HỌC SINH</w:t>
+      </w:r>
+      <w:r>
+        <w:t xml:space="preserve"> </w:t>
+      </w:r>
+      <w:r>
+        <w:rPr>
+          <w:b w:val="0"/>
+          <w:bCs w:val="0"/>
           <w:color w:val="000000"/>
-          <w:sz w:val="26"/>
-          <w:szCs w:val="26"/>
-        </w:rPr>
-        <w:t>Matching headings</w:t>
-      </w:r>
-      <w:r>
-        <w:rPr>
-          <w:b/>
-          <w:bCs/>
-          <w:color w:val="000000"/>
-          <w:sz w:val="26"/>
-          <w:szCs w:val="26"/>
-        </w:rPr>
-        <w:t>, Ôn tập TRUE-FALSE-NOT GIVEN</w:t>
-      </w:r>
-    </w:p>
-    <w:p>
-      <w:pPr>
-        <w:rPr>
-          <w:b/>
-          <w:bCs/>
-        </w:rPr>
-      </w:pPr>
-      <w:r>
-        <w:rPr>
-          <w:b/>
-          <w:bCs/>
-        </w:rPr>
-        <w:t>2. WRITING</w:t>
-      </w:r>
-      <w:r>
-        <w:rPr>
-          <w:b/>
-          <w:bCs/>
-        </w:rPr>
-        <w:t xml:space="preserve">: Writing task </w:t>
-      </w:r>
-      <w:r>
-        <w:rPr>
-          <w:b/>
-          <w:bCs/>
-        </w:rPr>
-        <w:t>1</w:t>
-      </w:r>
-      <w:r>
-        <w:rPr>
-          <w:b/>
-          <w:bCs/>
-        </w:rPr>
-        <w:t xml:space="preserve">, </w:t>
-      </w:r>
-      <w:r>
-        <w:rPr>
-          <w:b/>
-          <w:bCs/>
-        </w:rPr>
-        <w:t>cách viết overview.</w:t>
-      </w:r>
-    </w:p>
-    <w:p>
-      <w:pPr>
-        <w:rPr>
-          <w:b/>
-          <w:bCs/>
-        </w:rPr>
-      </w:pPr>
-      <w:r>
-        <w:rPr>
-          <w:b/>
-          <w:bCs/>
-        </w:rPr>
-        <w:t>3. LISTENING</w:t>
-      </w:r>
-      <w:r>
-        <w:rPr>
-          <w:b/>
-          <w:bCs/>
-        </w:rPr>
-        <w:t xml:space="preserve">: </w:t>
-      </w:r>
-      <w:r>
-        <w:rPr>
-          <w:b/>
-          <w:bCs/>
-        </w:rPr>
-        <w:t>Ôn tạp Flow-Chart labelling, học note completion</w:t>
-      </w:r>
-    </w:p>
-    <w:p>
-      <w:pPr>
-        <w:rPr>
-          <w:b/>
-          <w:bCs/>
-        </w:rPr>
-      </w:pPr>
-      <w:r>
-        <w:rPr>
-          <w:b/>
-          <w:bCs/>
-        </w:rPr>
-        <w:t>4. SPEAKING</w:t>
-      </w:r>
-      <w:r>
-        <w:rPr>
-          <w:b/>
-          <w:bCs/>
-        </w:rPr>
-        <w:t>:</w:t>
-      </w:r>
-      <w:r>
-        <w:rPr>
-          <w:b/>
-          <w:bCs/>
-        </w:rPr>
-        <w:t xml:space="preserve"> dạng câu hỏi would you, chủ đề television</w:t>
-      </w:r>
-    </w:p>
-    <w:p/>
-    <w:p>
-      <w:pPr>
-        <w:pStyle w:val="Heading2"/>
-      </w:pPr>
-      <w:bookmarkStart w:id="8" w:name="_va5mrd402v46" w:colFirst="0" w:colLast="0"/>
-      <w:bookmarkEnd w:id="8"/>
-      <w:r>
-        <w:t>III. TÌNH HÌNH HỌC SINH</w:t>
-      </w:r>
-    </w:p>
-    <w:p>
-      <w:r>
-        <w:t>Buổi 1:</w:t>
-      </w:r>
-      <w:r>
-        <w:tab/>
-        <w:t xml:space="preserve">Tổng số HS: </w:t>
-      </w:r>
-      <w:r>
-        <w:tab/>
-        <w:t>___</w:t>
-      </w:r>
-      <w:r>
-        <w:t>8</w:t>
-      </w:r>
-      <w:r>
-        <w:t>____</w:t>
-      </w:r>
-      <w:r>
-        <w:tab/>
-        <w:t>Có mặt: ___</w:t>
-      </w:r>
-      <w:r>
-        <w:t>8</w:t>
-      </w:r>
-      <w:r>
-        <w:t>____</w:t>
-      </w:r>
-      <w:r>
-        <w:tab/>
-        <w:t>Vắng: ___</w:t>
-      </w:r>
-      <w:r>
-        <w:t>0</w:t>
-      </w:r>
-      <w:r>
-        <w:t>____</w:t>
-      </w:r>
-    </w:p>
-    <w:p>
-      <w:r>
-        <w:t>Buổi 2:</w:t>
-      </w:r>
-      <w:r>
-        <w:tab/>
-        <w:t xml:space="preserve">Tổng số HS: </w:t>
-      </w:r>
-      <w:r>
-        <w:tab/>
-        <w:t>___</w:t>
-      </w:r>
-      <w:r>
-        <w:t>8</w:t>
-      </w:r>
-      <w:r>
-        <w:t>____</w:t>
-      </w:r>
-      <w:r>
-        <w:tab/>
-        <w:t>Có mặt: ____</w:t>
-      </w:r>
-      <w:r>
-        <w:t>8</w:t>
-      </w:r>
-      <w:r>
-        <w:t>___</w:t>
-      </w:r>
-      <w:r>
-        <w:tab/>
-        <w:t>Vắng: ___</w:t>
-      </w:r>
-      <w:r>
-        <w:t>0</w:t>
-      </w:r>
-      <w:r>
-        <w:t>____</w:t>
-      </w:r>
-    </w:p>
-    <w:p>
-      <w:r>
-        <w:t>Buổi 3:</w:t>
-      </w:r>
-      <w:r>
-        <w:tab/>
-        <w:t xml:space="preserve">Tổng số HS: </w:t>
-      </w:r>
-      <w:r>
-        <w:tab/>
-        <w:t>___</w:t>
-      </w:r>
-      <w:r>
-        <w:t>8</w:t>
-      </w:r>
-      <w:r>
-        <w:t>____</w:t>
-      </w:r>
-      <w:r>
-        <w:tab/>
-        <w:t>Có mặt: ____</w:t>
-      </w:r>
-      <w:r>
-        <w:t>8</w:t>
-      </w:r>
-      <w:r>
-        <w:t>___</w:t>
-      </w:r>
-      <w:r>
-        <w:tab/>
-        <w:t>Vắng: ___</w:t>
-      </w:r>
-      <w:r>
-        <w:t>0</w:t>
-      </w:r>
-      <w:r>
-        <w:t>____</w:t>
+        </w:rPr>
+        <w:t>(máy làm)</w:t>
+      </w:r>
+    </w:p>
+    <w:p>
+      <w:r>
+        <w:t>Buổi 1 (F1 U5-3 | B1 U14): Tổng số HS: 7 | Có mặt: 7 | Vắng: 0</w:t>
+      </w:r>
+    </w:p>
+    <w:p>
+      <w:r>
+        <w:t>Buổi 2 (F1 U6-1 | B1 U15): Tổng số HS: 7 | Có mặt: 5 | Vắng: 2</w:t>
+      </w:r>
+    </w:p>
+    <w:p>
+      <w:r>
+        <w:t>Buổi 3 (EXAM | F1 U6-2): Tổng số HS: 7 | Có mặt: 7 | Vắng: 0</w:t>
       </w:r>
     </w:p>
     <w:p>
@@ -655,6 +395,26 @@
           <w:szCs w:val="26"/>
         </w:rPr>
         <w:t>Học sinh cần theo dõi</w:t>
+      </w:r>
+      <w:r>
+        <w:rPr>
+          <w:b/>
+          <w:bCs/>
+          <w:color w:val="000000"/>
+          <w:sz w:val="26"/>
+          <w:szCs w:val="26"/>
+        </w:rPr>
+        <w:t xml:space="preserve"> </w:t>
+      </w:r>
+      <w:r>
+        <w:rPr>
+          <w:b/>
+          <w:bCs/>
+          <w:color w:val="000000"/>
+          <w:sz w:val="26"/>
+          <w:szCs w:val="26"/>
+        </w:rPr>
+        <w:t>(máy làm)</w:t>
       </w:r>
     </w:p>
     <w:tbl>
@@ -786,142 +546,36 @@
         </w:tc>
       </w:tr>
       <w:tr>
-        <w:trPr>
-          <w:trHeight w:val="230"/>
-        </w:trPr>
         <w:tc>
           <w:tcPr>
             <w:tcW w:w="1680" w:type="dxa"/>
-            <w:tcBorders>
-              <w:top w:val="single" w:sz="8" w:space="0" w:color="000000"/>
-              <w:left w:val="single" w:sz="8" w:space="0" w:color="000000"/>
-              <w:bottom w:val="single" w:sz="8" w:space="0" w:color="000000"/>
-              <w:right w:val="single" w:sz="8" w:space="0" w:color="000000"/>
-            </w:tcBorders>
-            <w:tcMar>
-              <w:top w:w="100" w:type="dxa"/>
-              <w:left w:w="100" w:type="dxa"/>
-              <w:bottom w:w="100" w:type="dxa"/>
-              <w:right w:w="100" w:type="dxa"/>
-            </w:tcMar>
           </w:tcPr>
           <w:p>
             <w:r>
-              <w:lastRenderedPageBreak/>
-              <w:t>Đức Bình</w:t>
+              <w:t>Cả lớp</w:t>
             </w:r>
           </w:p>
         </w:tc>
         <w:tc>
           <w:tcPr>
             <w:tcW w:w="2715" w:type="dxa"/>
-            <w:tcBorders>
-              <w:top w:val="single" w:sz="8" w:space="0" w:color="000000"/>
-              <w:left w:val="single" w:sz="8" w:space="0" w:color="000000"/>
-              <w:bottom w:val="single" w:sz="8" w:space="0" w:color="000000"/>
-              <w:right w:val="single" w:sz="8" w:space="0" w:color="000000"/>
-            </w:tcBorders>
-            <w:tcMar>
-              <w:top w:w="100" w:type="dxa"/>
-              <w:left w:w="100" w:type="dxa"/>
-              <w:bottom w:w="100" w:type="dxa"/>
-              <w:right w:w="100" w:type="dxa"/>
-            </w:tcMar>
           </w:tcPr>
           <w:p>
             <w:r>
-              <w:t>Yếu từ vựng, đặc biệt là phrases, xây dựng câu đơn chưa được</w:t>
+              <w:t>Đi học và hoàn thành bài đầy đủ, không có vấn đề phát sinh.</w:t>
             </w:r>
           </w:p>
         </w:tc>
         <w:tc>
           <w:tcPr>
             <w:tcW w:w="4605" w:type="dxa"/>
-            <w:tcBorders>
-              <w:top w:val="single" w:sz="8" w:space="0" w:color="000000"/>
-              <w:left w:val="single" w:sz="8" w:space="0" w:color="000000"/>
-              <w:bottom w:val="single" w:sz="8" w:space="0" w:color="000000"/>
-              <w:right w:val="single" w:sz="8" w:space="0" w:color="000000"/>
-            </w:tcBorders>
-            <w:tcMar>
-              <w:top w:w="100" w:type="dxa"/>
-              <w:left w:w="100" w:type="dxa"/>
-              <w:bottom w:w="100" w:type="dxa"/>
-              <w:right w:w="100" w:type="dxa"/>
-            </w:tcMar>
-          </w:tcPr>
-          <w:p/>
-        </w:tc>
-      </w:tr>
-      <w:tr>
-        <w:trPr>
-          <w:trHeight w:val="230"/>
-        </w:trPr>
-        <w:tc>
-          <w:tcPr>
-            <w:tcW w:w="1680" w:type="dxa"/>
-            <w:tcBorders>
-              <w:top w:val="single" w:sz="8" w:space="0" w:color="000000"/>
-              <w:left w:val="single" w:sz="8" w:space="0" w:color="000000"/>
-              <w:bottom w:val="single" w:sz="8" w:space="0" w:color="000000"/>
-              <w:right w:val="single" w:sz="8" w:space="0" w:color="000000"/>
-            </w:tcBorders>
-            <w:tcMar>
-              <w:top w:w="100" w:type="dxa"/>
-              <w:left w:w="100" w:type="dxa"/>
-              <w:bottom w:w="100" w:type="dxa"/>
-              <w:right w:w="100" w:type="dxa"/>
-            </w:tcMar>
           </w:tcPr>
           <w:p>
             <w:r>
-              <w:t>Quốc</w:t>
+              <w:t>Tiếp tục phát huy</w:t>
             </w:r>
           </w:p>
         </w:tc>
-        <w:tc>
-          <w:tcPr>
-            <w:tcW w:w="2715" w:type="dxa"/>
-            <w:tcBorders>
-              <w:top w:val="single" w:sz="8" w:space="0" w:color="000000"/>
-              <w:left w:val="single" w:sz="8" w:space="0" w:color="000000"/>
-              <w:bottom w:val="single" w:sz="8" w:space="0" w:color="000000"/>
-              <w:right w:val="single" w:sz="8" w:space="0" w:color="000000"/>
-            </w:tcBorders>
-            <w:tcMar>
-              <w:top w:w="100" w:type="dxa"/>
-              <w:left w:w="100" w:type="dxa"/>
-              <w:bottom w:w="100" w:type="dxa"/>
-              <w:right w:w="100" w:type="dxa"/>
-            </w:tcMar>
-          </w:tcPr>
-          <w:p>
-            <w:r>
-              <w:t>Yếu từ vựng</w:t>
-            </w:r>
-            <w:r>
-              <w:t>, phrases</w:t>
-            </w:r>
-          </w:p>
-        </w:tc>
-        <w:tc>
-          <w:tcPr>
-            <w:tcW w:w="4605" w:type="dxa"/>
-            <w:tcBorders>
-              <w:top w:val="single" w:sz="8" w:space="0" w:color="000000"/>
-              <w:left w:val="single" w:sz="8" w:space="0" w:color="000000"/>
-              <w:bottom w:val="single" w:sz="8" w:space="0" w:color="000000"/>
-              <w:right w:val="single" w:sz="8" w:space="0" w:color="000000"/>
-            </w:tcBorders>
-            <w:tcMar>
-              <w:top w:w="100" w:type="dxa"/>
-              <w:left w:w="100" w:type="dxa"/>
-              <w:bottom w:w="100" w:type="dxa"/>
-              <w:right w:w="100" w:type="dxa"/>
-            </w:tcMar>
-          </w:tcPr>
-          <w:p/>
-        </w:tc>
       </w:tr>
     </w:tbl>
     <w:p>
@@ -951,6 +605,17 @@
         <w:lastRenderedPageBreak/>
         <w:t>IV. CÔNG TÁC GIẢNG DẠY</w:t>
       </w:r>
+      <w:r>
+        <w:t xml:space="preserve"> </w:t>
+      </w:r>
+      <w:r>
+        <w:rPr>
+          <w:b w:val="0"/>
+          <w:bCs w:val="0"/>
+          <w:color w:val="000000"/>
+        </w:rPr>
+        <w:t>(máy làm)</w:t>
+      </w:r>
     </w:p>
     <w:p>
       <w:pPr>
@@ -983,15 +648,6 @@
       <w:r>
         <w:tab/>
         <w:t>☐ Chữa BTVN</w:t>
-      </w:r>
-      <w:r>
-        <w:tab/>
-        <w:t>☐ Gửi reminders đầy đủ</w:t>
-      </w:r>
-    </w:p>
-    <w:p>
-      <w:r>
-        <w:t>☐ Không có vấn đề phát sinh</w:t>
       </w:r>
     </w:p>
     <w:p/>
@@ -1006,6 +662,9 @@
       <w:r>
         <w:t>V. KHÓ KHĂN / HỖ TRỢ CẦN THIẾT</w:t>
       </w:r>
+      <w:r>
+        <w:t xml:space="preserve"> (tôi làm)</w:t>
+      </w:r>
     </w:p>
     <w:p>
       <w:pPr>
@@ -1025,22 +684,22 @@
     <w:p>
       <w:r>
         <w:pict w14:anchorId="69554C21">
-          <v:rect id="_x0000_i1034" style="width:0;height:1.5pt" o:hralign="center" o:hrstd="t" o:hr="t" fillcolor="#a0a0a0" stroked="f"/>
+          <v:rect id="_x0000_i1028" style="width:0;height:1.5pt" o:hralign="center" o:hrstd="t" o:hr="t" fillcolor="#a0a0a0" stroked="f"/>
         </w:pict>
       </w:r>
       <w:r>
         <w:pict w14:anchorId="085681C2">
-          <v:rect id="_x0000_i1035" style="width:0;height:1.5pt" o:hralign="center" o:hrstd="t" o:hr="t" fillcolor="#a0a0a0" stroked="f"/>
+          <v:rect id="_x0000_i1029" style="width:0;height:1.5pt" o:hralign="center" o:hrstd="t" o:hr="t" fillcolor="#a0a0a0" stroked="f"/>
         </w:pict>
       </w:r>
       <w:r>
         <w:pict w14:anchorId="79BC94F0">
-          <v:rect id="_x0000_i1036" style="width:0;height:1.5pt" o:hralign="center" o:hrstd="t" o:hr="t" fillcolor="#a0a0a0" stroked="f"/>
+          <v:rect id="_x0000_i1030" style="width:0;height:1.5pt" o:hralign="center" o:hrstd="t" o:hr="t" fillcolor="#a0a0a0" stroked="f"/>
         </w:pict>
       </w:r>
       <w:r>
         <w:pict w14:anchorId="52AAB47F">
-          <v:rect id="_x0000_i1037" style="width:0;height:1.5pt" o:hralign="center" o:hrstd="t" o:hr="t" fillcolor="#a0a0a0" stroked="f"/>
+          <v:rect id="_x0000_i1031" style="width:0;height:1.5pt" o:hralign="center" o:hrstd="t" o:hr="t" fillcolor="#a0a0a0" stroked="f"/>
         </w:pict>
       </w:r>
     </w:p>
@@ -1064,6 +723,9 @@
       <w:r>
         <w:t>VI. TỰ ĐÁNH GIÁ</w:t>
       </w:r>
+      <w:r>
+        <w:t xml:space="preserve"> (tôi làm)</w:t>
+      </w:r>
     </w:p>
     <w:p>
       <w:r>
@@ -1105,10 +767,14 @@
           <w:b/>
           <w:bCs/>
         </w:rPr>
-        <w:t>Ngày nộp:</w:t>
-      </w:r>
-      <w:r>
-        <w:t xml:space="preserve"> ____ / ____ / ______</w:t>
+        <w:t xml:space="preserve">(máy làm) </w:t>
+      </w:r>
+      <w:r>
+        <w:rPr>
+          <w:b/>
+          <w:bCs/>
+        </w:rPr>
+        <w:t>Ngày nộp: 27 / 09 / 2026</w:t>
       </w:r>
     </w:p>
     <w:p>
@@ -1129,7 +795,7 @@
           <w:i/>
           <w:iCs/>
         </w:rPr>
-        <w:t>Giáo viên ký tên</w:t>
+        <w:t>Giáo viên: Tiến Trương Minh</w:t>
       </w:r>
     </w:p>
     <w:p/>
@@ -1146,7 +812,7 @@
 </file>
 
 <file path=word/endnotes.xml><?xml version="1.0" encoding="utf-8"?>
-<w:endnotes xmlns:wpc="http://schemas.microsoft.com/office/word/2010/wordprocessingCanvas" xmlns:cx="http://schemas.microsoft.com/office/drawing/2014/chartex" xmlns:cx1="http://schemas.microsoft.com/office/drawing/2015/9/8/chartex" xmlns:cx2="http://schemas.microsoft.com/office/drawing/2015/10/21/chartex" xmlns:cx3="http://schemas.microsoft.com/office/drawing/2016/5/9/chartex" xmlns:cx4="http://schemas.microsoft.com/office/drawing/2016/5/10/chartex" xmlns:cx5="http://schemas.microsoft.com/office/drawing/2016/5/11/chartex" xmlns:cx6="http://schemas.microsoft.com/office/drawing/2016/5/12/chartex" xmlns:cx7="http://schemas.microsoft.com/office/drawing/2016/5/13/chartex" xmlns:cx8="http://schemas.microsoft.com/office/drawing/2016/5/14/chartex" xmlns:mc="http://schemas.openxmlformats.org/markup-compatibility/2006" xmlns:aink="http://schemas.microsoft.com/office/drawing/2016/ink" xmlns:am3d="http://schemas.microsoft.com/office/drawing/2017/model3d" xmlns:o="urn:schemas-microsoft-com:office:office" xmlns:oel="http://schemas.microsoft.com/office/2019/extlst" xmlns:r="http://schemas.openxmlformats.org/officeDocument/2006/relationships" xmlns:m="http://schemas.openxmlformats.org/officeDocument/2006/math" xmlns:v="urn:schemas-microsoft-com:vml" xmlns:wp14="http://schemas.microsoft.com/office/word/2010/wordprocessingDrawing" xmlns:wp="http://schemas.openxmlformats.org/drawingml/2006/wordprocessingDrawing" xmlns:w10="urn:schemas-microsoft-com:office:word" xmlns:w="http://schemas.openxmlformats.org/wordprocessingml/2006/main" xmlns:w14="http://schemas.microsoft.com/office/word/2010/wordml" xmlns:w15="http://schemas.microsoft.com/office/word/2012/wordml" xmlns:w16cei="http://schemas.microsoft.com/office/word/2026/wordml/cei" xmlns:w16cex="http://schemas.microsoft.com/office/word/2018/wordml/cex" xmlns:w16cid="http://schemas.microsoft.com/office/word/2016/wordml/cid" xmlns:w16="http://schemas.microsoft.com/office/word/2018/wordml" xmlns:w16du="http://schemas.microsoft.com/office/word/2023/wordml/word16du" xmlns:w16sdtdh="http://schemas.microsoft.com/office/word/2020/wordml/sdtdatahash" xmlns:w16sdtfl="http://schemas.microsoft.com/office/word/2024/wordml/sdtformatlock" xmlns:w16se="http://schemas.microsoft.com/office/word/2015/wordml/symex" xmlns:wpg="http://schemas.microsoft.com/office/word/2010/wordprocessingGroup" xmlns:wpi="http://schemas.microsoft.com/office/word/2010/wordprocessingInk" xmlns:wne="http://schemas.microsoft.com/office/word/2006/wordml" xmlns:wps="http://schemas.microsoft.com/office/word/2010/wordprocessingShape" mc:Ignorable="w14 w15 w16se w16cid w16 w16cex w16sdtdh w16sdtfl w16du wp14">
+<w:endnotes xmlns:wpc="http://schemas.microsoft.com/office/word/2010/wordprocessingCanvas" xmlns:cx="http://schemas.microsoft.com/office/drawing/2014/chartex" xmlns:cx1="http://schemas.microsoft.com/office/drawing/2015/9/8/chartex" xmlns:cx2="http://schemas.microsoft.com/office/drawing/2015/10/21/chartex" xmlns:cx3="http://schemas.microsoft.com/office/drawing/2016/5/9/chartex" xmlns:cx4="http://schemas.microsoft.com/office/drawing/2016/5/10/chartex" xmlns:cx5="http://schemas.microsoft.com/office/drawing/2016/5/11/chartex" xmlns:cx6="http://schemas.microsoft.com/office/drawing/2016/5/12/chartex" xmlns:cx7="http://schemas.microsoft.com/office/drawing/2016/5/13/chartex" xmlns:cx8="http://schemas.microsoft.com/office/drawing/2016/5/14/chartex" xmlns:mc="http://schemas.openxmlformats.org/markup-compatibility/2006" xmlns:aink="http://schemas.microsoft.com/office/drawing/2016/ink" xmlns:am3d="http://schemas.microsoft.com/office/drawing/2017/model3d" xmlns:o="urn:schemas-microsoft-com:office:office" xmlns:oel="http://schemas.microsoft.com/office/2019/extlst" xmlns:r="http://schemas.openxmlformats.org/officeDocument/2006/relationships" xmlns:m="http://schemas.openxmlformats.org/officeDocument/2006/math" xmlns:v="urn:schemas-microsoft-com:vml" xmlns:wp14="http://schemas.microsoft.com/office/word/2010/wordprocessingDrawing" xmlns:wp="http://schemas.openxmlformats.org/drawingml/2006/wordprocessingDrawing" xmlns:w10="urn:schemas-microsoft-com:office:word" xmlns:w="http://schemas.openxmlformats.org/wordprocessingml/2006/main" xmlns:w14="http://schemas.microsoft.com/office/word/2010/wordml" xmlns:w15="http://schemas.microsoft.com/office/word/2012/wordml" xmlns:w16cex="http://schemas.microsoft.com/office/word/2018/wordml/cex" xmlns:w16cid="http://schemas.microsoft.com/office/word/2016/wordml/cid" xmlns:w16="http://schemas.microsoft.com/office/word/2018/wordml" xmlns:w16du="http://schemas.microsoft.com/office/word/2023/wordml/word16du" xmlns:w16sdtdh="http://schemas.microsoft.com/office/word/2020/wordml/sdtdatahash" xmlns:w16sdtfl="http://schemas.microsoft.com/office/word/2024/wordml/sdtformatlock" xmlns:w16se="http://schemas.microsoft.com/office/word/2015/wordml/symex" xmlns:wpg="http://schemas.microsoft.com/office/word/2010/wordprocessingGroup" xmlns:wpi="http://schemas.microsoft.com/office/word/2010/wordprocessingInk" xmlns:wne="http://schemas.microsoft.com/office/word/2006/wordml" xmlns:wps="http://schemas.microsoft.com/office/word/2010/wordprocessingShape" mc:Ignorable="w14 w15 w16se w16cid w16 w16cex w16sdtdh w16sdtfl w16du wp14">
   <w:endnote w:type="separator" w:id="-1">
     <w:p>
       <w:pPr>
@@ -1171,7 +837,7 @@
 </file>
 
 <file path=word/footer1.xml><?xml version="1.0" encoding="utf-8"?>
-<w:ftr xmlns:wpc="http://schemas.microsoft.com/office/word/2010/wordprocessingCanvas" xmlns:cx="http://schemas.microsoft.com/office/drawing/2014/chartex" xmlns:cx1="http://schemas.microsoft.com/office/drawing/2015/9/8/chartex" xmlns:cx2="http://schemas.microsoft.com/office/drawing/2015/10/21/chartex" xmlns:cx3="http://schemas.microsoft.com/office/drawing/2016/5/9/chartex" xmlns:cx4="http://schemas.microsoft.com/office/drawing/2016/5/10/chartex" xmlns:cx5="http://schemas.microsoft.com/office/drawing/2016/5/11/chartex" xmlns:cx6="http://schemas.microsoft.com/office/drawing/2016/5/12/chartex" xmlns:cx7="http://schemas.microsoft.com/office/drawing/2016/5/13/chartex" xmlns:cx8="http://schemas.microsoft.com/office/drawing/2016/5/14/chartex" xmlns:mc="http://schemas.openxmlformats.org/markup-compatibility/2006" xmlns:aink="http://schemas.microsoft.com/office/drawing/2016/ink" xmlns:am3d="http://schemas.microsoft.com/office/drawing/2017/model3d" xmlns:o="urn:schemas-microsoft-com:office:office" xmlns:oel="http://schemas.microsoft.com/office/2019/extlst" xmlns:r="http://schemas.openxmlformats.org/officeDocument/2006/relationships" xmlns:m="http://schemas.openxmlformats.org/officeDocument/2006/math" xmlns:v="urn:schemas-microsoft-com:vml" xmlns:wp14="http://schemas.microsoft.com/office/word/2010/wordprocessingDrawing" xmlns:wp="http://schemas.openxmlformats.org/drawingml/2006/wordprocessingDrawing" xmlns:w10="urn:schemas-microsoft-com:office:word" xmlns:w="http://schemas.openxmlformats.org/wordprocessingml/2006/main" xmlns:w14="http://schemas.microsoft.com/office/word/2010/wordml" xmlns:w15="http://schemas.microsoft.com/office/word/2012/wordml" xmlns:w16cei="http://schemas.microsoft.com/office/word/2026/wordml/cei" xmlns:w16cex="http://schemas.microsoft.com/office/word/2018/wordml/cex" xmlns:w16cid="http://schemas.microsoft.com/office/word/2016/wordml/cid" xmlns:w16="http://schemas.microsoft.com/office/word/2018/wordml" xmlns:w16du="http://schemas.microsoft.com/office/word/2023/wordml/word16du" xmlns:w16sdtdh="http://schemas.microsoft.com/office/word/2020/wordml/sdtdatahash" xmlns:w16sdtfl="http://schemas.microsoft.com/office/word/2024/wordml/sdtformatlock" xmlns:w16se="http://schemas.microsoft.com/office/word/2015/wordml/symex" xmlns:wpg="http://schemas.microsoft.com/office/word/2010/wordprocessingGroup" xmlns:wpi="http://schemas.microsoft.com/office/word/2010/wordprocessingInk" xmlns:wne="http://schemas.microsoft.com/office/word/2006/wordml" xmlns:wps="http://schemas.microsoft.com/office/word/2010/wordprocessingShape" mc:Ignorable="w14 w15 w16se w16cid w16 w16cex w16sdtdh w16sdtfl w16du wp14">
+<w:ftr xmlns:wpc="http://schemas.microsoft.com/office/word/2010/wordprocessingCanvas" xmlns:cx="http://schemas.microsoft.com/office/drawing/2014/chartex" xmlns:cx1="http://schemas.microsoft.com/office/drawing/2015/9/8/chartex" xmlns:cx2="http://schemas.microsoft.com/office/drawing/2015/10/21/chartex" xmlns:cx3="http://schemas.microsoft.com/office/drawing/2016/5/9/chartex" xmlns:cx4="http://schemas.microsoft.com/office/drawing/2016/5/10/chartex" xmlns:cx5="http://schemas.microsoft.com/office/drawing/2016/5/11/chartex" xmlns:cx6="http://schemas.microsoft.com/office/drawing/2016/5/12/chartex" xmlns:cx7="http://schemas.microsoft.com/office/drawing/2016/5/13/chartex" xmlns:cx8="http://schemas.microsoft.com/office/drawing/2016/5/14/chartex" xmlns:mc="http://schemas.openxmlformats.org/markup-compatibility/2006" xmlns:aink="http://schemas.microsoft.com/office/drawing/2016/ink" xmlns:am3d="http://schemas.microsoft.com/office/drawing/2017/model3d" xmlns:o="urn:schemas-microsoft-com:office:office" xmlns:oel="http://schemas.microsoft.com/office/2019/extlst" xmlns:r="http://schemas.openxmlformats.org/officeDocument/2006/relationships" xmlns:m="http://schemas.openxmlformats.org/officeDocument/2006/math" xmlns:v="urn:schemas-microsoft-com:vml" xmlns:wp14="http://schemas.microsoft.com/office/word/2010/wordprocessingDrawing" xmlns:wp="http://schemas.openxmlformats.org/drawingml/2006/wordprocessingDrawing" xmlns:w10="urn:schemas-microsoft-com:office:word" xmlns:w="http://schemas.openxmlformats.org/wordprocessingml/2006/main" xmlns:w14="http://schemas.microsoft.com/office/word/2010/wordml" xmlns:w15="http://schemas.microsoft.com/office/word/2012/wordml" xmlns:w16cex="http://schemas.microsoft.com/office/word/2018/wordml/cex" xmlns:w16cid="http://schemas.microsoft.com/office/word/2016/wordml/cid" xmlns:w16="http://schemas.microsoft.com/office/word/2018/wordml" xmlns:w16du="http://schemas.microsoft.com/office/word/2023/wordml/word16du" xmlns:w16sdtdh="http://schemas.microsoft.com/office/word/2020/wordml/sdtdatahash" xmlns:w16sdtfl="http://schemas.microsoft.com/office/word/2024/wordml/sdtformatlock" xmlns:w16se="http://schemas.microsoft.com/office/word/2015/wordml/symex" xmlns:wpg="http://schemas.microsoft.com/office/word/2010/wordprocessingGroup" xmlns:wpi="http://schemas.microsoft.com/office/word/2010/wordprocessingInk" xmlns:wne="http://schemas.microsoft.com/office/word/2006/wordml" xmlns:wps="http://schemas.microsoft.com/office/word/2010/wordprocessingShape" mc:Ignorable="w14 w15 w16se w16cid w16 w16cex w16sdtdh w16sdtfl w16du wp14">
   <w:p>
     <w:pPr>
       <w:jc w:val="center"/>
@@ -1252,7 +918,7 @@
 </file>
 
 <file path=word/footnotes.xml><?xml version="1.0" encoding="utf-8"?>
-<w:footnotes xmlns:wpc="http://schemas.microsoft.com/office/word/2010/wordprocessingCanvas" xmlns:cx="http://schemas.microsoft.com/office/drawing/2014/chartex" xmlns:cx1="http://schemas.microsoft.com/office/drawing/2015/9/8/chartex" xmlns:cx2="http://schemas.microsoft.com/office/drawing/2015/10/21/chartex" xmlns:cx3="http://schemas.microsoft.com/office/drawing/2016/5/9/chartex" xmlns:cx4="http://schemas.microsoft.com/office/drawing/2016/5/10/chartex" xmlns:cx5="http://schemas.microsoft.com/office/drawing/2016/5/11/chartex" xmlns:cx6="http://schemas.microsoft.com/office/drawing/2016/5/12/chartex" xmlns:cx7="http://schemas.microsoft.com/office/drawing/2016/5/13/chartex" xmlns:cx8="http://schemas.microsoft.com/office/drawing/2016/5/14/chartex" xmlns:mc="http://schemas.openxmlformats.org/markup-compatibility/2006" xmlns:aink="http://schemas.microsoft.com/office/drawing/2016/ink" xmlns:am3d="http://schemas.microsoft.com/office/drawing/2017/model3d" xmlns:o="urn:schemas-microsoft-com:office:office" xmlns:oel="http://schemas.microsoft.com/office/2019/extlst" xmlns:r="http://schemas.openxmlformats.org/officeDocument/2006/relationships" xmlns:m="http://schemas.openxmlformats.org/officeDocument/2006/math" xmlns:v="urn:schemas-microsoft-com:vml" xmlns:wp14="http://schemas.microsoft.com/office/word/2010/wordprocessingDrawing" xmlns:wp="http://schemas.openxmlformats.org/drawingml/2006/wordprocessingDrawing" xmlns:w10="urn:schemas-microsoft-com:office:word" xmlns:w="http://schemas.openxmlformats.org/wordprocessingml/2006/main" xmlns:w14="http://schemas.microsoft.com/office/word/2010/wordml" xmlns:w15="http://schemas.microsoft.com/office/word/2012/wordml" xmlns:w16cei="http://schemas.microsoft.com/office/word/2026/wordml/cei" xmlns:w16cex="http://schemas.microsoft.com/office/word/2018/wordml/cex" xmlns:w16cid="http://schemas.microsoft.com/office/word/2016/wordml/cid" xmlns:w16="http://schemas.microsoft.com/office/word/2018/wordml" xmlns:w16du="http://schemas.microsoft.com/office/word/2023/wordml/word16du" xmlns:w16sdtdh="http://schemas.microsoft.com/office/word/2020/wordml/sdtdatahash" xmlns:w16sdtfl="http://schemas.microsoft.com/office/word/2024/wordml/sdtformatlock" xmlns:w16se="http://schemas.microsoft.com/office/word/2015/wordml/symex" xmlns:wpg="http://schemas.microsoft.com/office/word/2010/wordprocessingGroup" xmlns:wpi="http://schemas.microsoft.com/office/word/2010/wordprocessingInk" xmlns:wne="http://schemas.microsoft.com/office/word/2006/wordml" xmlns:wps="http://schemas.microsoft.com/office/word/2010/wordprocessingShape" mc:Ignorable="w14 w15 w16se w16cid w16 w16cex w16sdtdh w16sdtfl w16du wp14">
+<w:footnotes xmlns:wpc="http://schemas.microsoft.com/office/word/2010/wordprocessingCanvas" xmlns:cx="http://schemas.microsoft.com/office/drawing/2014/chartex" xmlns:cx1="http://schemas.microsoft.com/office/drawing/2015/9/8/chartex" xmlns:cx2="http://schemas.microsoft.com/office/drawing/2015/10/21/chartex" xmlns:cx3="http://schemas.microsoft.com/office/drawing/2016/5/9/chartex" xmlns:cx4="http://schemas.microsoft.com/office/drawing/2016/5/10/chartex" xmlns:cx5="http://schemas.microsoft.com/office/drawing/2016/5/11/chartex" xmlns:cx6="http://schemas.microsoft.com/office/drawing/2016/5/12/chartex" xmlns:cx7="http://schemas.microsoft.com/office/drawing/2016/5/13/chartex" xmlns:cx8="http://schemas.microsoft.com/office/drawing/2016/5/14/chartex" xmlns:mc="http://schemas.openxmlformats.org/markup-compatibility/2006" xmlns:aink="http://schemas.microsoft.com/office/drawing/2016/ink" xmlns:am3d="http://schemas.microsoft.com/office/drawing/2017/model3d" xmlns:o="urn:schemas-microsoft-com:office:office" xmlns:oel="http://schemas.microsoft.com/office/2019/extlst" xmlns:r="http://schemas.openxmlformats.org/officeDocument/2006/relationships" xmlns:m="http://schemas.openxmlformats.org/officeDocument/2006/math" xmlns:v="urn:schemas-microsoft-com:vml" xmlns:wp14="http://schemas.microsoft.com/office/word/2010/wordprocessingDrawing" xmlns:wp="http://schemas.openxmlformats.org/drawingml/2006/wordprocessingDrawing" xmlns:w10="urn:schemas-microsoft-com:office:word" xmlns:w="http://schemas.openxmlformats.org/wordprocessingml/2006/main" xmlns:w14="http://schemas.microsoft.com/office/word/2010/wordml" xmlns:w15="http://schemas.microsoft.com/office/word/2012/wordml" xmlns:w16cex="http://schemas.microsoft.com/office/word/2018/wordml/cex" xmlns:w16cid="http://schemas.microsoft.com/office/word/2016/wordml/cid" xmlns:w16="http://schemas.microsoft.com/office/word/2018/wordml" xmlns:w16du="http://schemas.microsoft.com/office/word/2023/wordml/word16du" xmlns:w16sdtdh="http://schemas.microsoft.com/office/word/2020/wordml/sdtdatahash" xmlns:w16sdtfl="http://schemas.microsoft.com/office/word/2024/wordml/sdtformatlock" xmlns:w16se="http://schemas.microsoft.com/office/word/2015/wordml/symex" xmlns:wpg="http://schemas.microsoft.com/office/word/2010/wordprocessingGroup" xmlns:wpi="http://schemas.microsoft.com/office/word/2010/wordprocessingInk" xmlns:wne="http://schemas.microsoft.com/office/word/2006/wordml" xmlns:wps="http://schemas.microsoft.com/office/word/2010/wordprocessingShape" mc:Ignorable="w14 w15 w16se w16cid w16 w16cex w16sdtdh w16sdtfl w16du wp14">
   <w:footnote w:type="separator" w:id="-1">
     <w:p>
       <w:pPr>
@@ -1277,7 +943,7 @@
 </file>
 
 <file path=word/header1.xml><?xml version="1.0" encoding="utf-8"?>
-<w:hdr xmlns:wpc="http://schemas.microsoft.com/office/word/2010/wordprocessingCanvas" xmlns:cx="http://schemas.microsoft.com/office/drawing/2014/chartex" xmlns:cx1="http://schemas.microsoft.com/office/drawing/2015/9/8/chartex" xmlns:cx2="http://schemas.microsoft.com/office/drawing/2015/10/21/chartex" xmlns:cx3="http://schemas.microsoft.com/office/drawing/2016/5/9/chartex" xmlns:cx4="http://schemas.microsoft.com/office/drawing/2016/5/10/chartex" xmlns:cx5="http://schemas.microsoft.com/office/drawing/2016/5/11/chartex" xmlns:cx6="http://schemas.microsoft.com/office/drawing/2016/5/12/chartex" xmlns:cx7="http://schemas.microsoft.com/office/drawing/2016/5/13/chartex" xmlns:cx8="http://schemas.microsoft.com/office/drawing/2016/5/14/chartex" xmlns:mc="http://schemas.openxmlformats.org/markup-compatibility/2006" xmlns:aink="http://schemas.microsoft.com/office/drawing/2016/ink" xmlns:am3d="http://schemas.microsoft.com/office/drawing/2017/model3d" xmlns:o="urn:schemas-microsoft-com:office:office" xmlns:oel="http://schemas.microsoft.com/office/2019/extlst" xmlns:r="http://schemas.openxmlformats.org/officeDocument/2006/relationships" xmlns:m="http://schemas.openxmlformats.org/officeDocument/2006/math" xmlns:v="urn:schemas-microsoft-com:vml" xmlns:wp14="http://schemas.microsoft.com/office/word/2010/wordprocessingDrawing" xmlns:wp="http://schemas.openxmlformats.org/drawingml/2006/wordprocessingDrawing" xmlns:w10="urn:schemas-microsoft-com:office:word" xmlns:w="http://schemas.openxmlformats.org/wordprocessingml/2006/main" xmlns:w14="http://schemas.microsoft.com/office/word/2010/wordml" xmlns:w15="http://schemas.microsoft.com/office/word/2012/wordml" xmlns:w16cei="http://schemas.microsoft.com/office/word/2026/wordml/cei" xmlns:w16cex="http://schemas.microsoft.com/office/word/2018/wordml/cex" xmlns:w16cid="http://schemas.microsoft.com/office/word/2016/wordml/cid" xmlns:w16="http://schemas.microsoft.com/office/word/2018/wordml" xmlns:w16du="http://schemas.microsoft.com/office/word/2023/wordml/word16du" xmlns:w16sdtdh="http://schemas.microsoft.com/office/word/2020/wordml/sdtdatahash" xmlns:w16sdtfl="http://schemas.microsoft.com/office/word/2024/wordml/sdtformatlock" xmlns:w16se="http://schemas.microsoft.com/office/word/2015/wordml/symex" xmlns:wpg="http://schemas.microsoft.com/office/word/2010/wordprocessingGroup" xmlns:wpi="http://schemas.microsoft.com/office/word/2010/wordprocessingInk" xmlns:wne="http://schemas.microsoft.com/office/word/2006/wordml" xmlns:wps="http://schemas.microsoft.com/office/word/2010/wordprocessingShape" mc:Ignorable="w14 w15 w16se w16cid w16 w16cex w16sdtdh w16sdtfl w16du wp14">
+<w:hdr xmlns:wpc="http://schemas.microsoft.com/office/word/2010/wordprocessingCanvas" xmlns:cx="http://schemas.microsoft.com/office/drawing/2014/chartex" xmlns:cx1="http://schemas.microsoft.com/office/drawing/2015/9/8/chartex" xmlns:cx2="http://schemas.microsoft.com/office/drawing/2015/10/21/chartex" xmlns:cx3="http://schemas.microsoft.com/office/drawing/2016/5/9/chartex" xmlns:cx4="http://schemas.microsoft.com/office/drawing/2016/5/10/chartex" xmlns:cx5="http://schemas.microsoft.com/office/drawing/2016/5/11/chartex" xmlns:cx6="http://schemas.microsoft.com/office/drawing/2016/5/12/chartex" xmlns:cx7="http://schemas.microsoft.com/office/drawing/2016/5/13/chartex" xmlns:cx8="http://schemas.microsoft.com/office/drawing/2016/5/14/chartex" xmlns:mc="http://schemas.openxmlformats.org/markup-compatibility/2006" xmlns:aink="http://schemas.microsoft.com/office/drawing/2016/ink" xmlns:am3d="http://schemas.microsoft.com/office/drawing/2017/model3d" xmlns:o="urn:schemas-microsoft-com:office:office" xmlns:oel="http://schemas.microsoft.com/office/2019/extlst" xmlns:r="http://schemas.openxmlformats.org/officeDocument/2006/relationships" xmlns:m="http://schemas.openxmlformats.org/officeDocument/2006/math" xmlns:v="urn:schemas-microsoft-com:vml" xmlns:wp14="http://schemas.microsoft.com/office/word/2010/wordprocessingDrawing" xmlns:wp="http://schemas.openxmlformats.org/drawingml/2006/wordprocessingDrawing" xmlns:w10="urn:schemas-microsoft-com:office:word" xmlns:w="http://schemas.openxmlformats.org/wordprocessingml/2006/main" xmlns:w14="http://schemas.microsoft.com/office/word/2010/wordml" xmlns:w15="http://schemas.microsoft.com/office/word/2012/wordml" xmlns:w16cex="http://schemas.microsoft.com/office/word/2018/wordml/cex" xmlns:w16cid="http://schemas.microsoft.com/office/word/2016/wordml/cid" xmlns:w16="http://schemas.microsoft.com/office/word/2018/wordml" xmlns:w16du="http://schemas.microsoft.com/office/word/2023/wordml/word16du" xmlns:w16sdtdh="http://schemas.microsoft.com/office/word/2020/wordml/sdtdatahash" xmlns:w16sdtfl="http://schemas.microsoft.com/office/word/2024/wordml/sdtformatlock" xmlns:w16se="http://schemas.microsoft.com/office/word/2015/wordml/symex" xmlns:wpg="http://schemas.microsoft.com/office/word/2010/wordprocessingGroup" xmlns:wpi="http://schemas.microsoft.com/office/word/2010/wordprocessingInk" xmlns:wne="http://schemas.microsoft.com/office/word/2006/wordml" xmlns:wps="http://schemas.microsoft.com/office/word/2010/wordprocessingShape" mc:Ignorable="w14 w15 w16se w16cid w16 w16cex w16sdtdh w16sdtfl w16du wp14">
   <w:p>
     <w:r>
       <w:pict w14:anchorId="7205D3EB">

</xml_diff>

<commit_message>
feat: loai bo ghi chu noi bo trong docx va modal, bo sung security headers va kiem thu bao mat
</commit_message>
<xml_diff>
--- a/backend/src/main/resources/templates/weekly_report_template.docx
+++ b/backend/src/main/resources/templates/weekly_report_template.docx
@@ -63,9 +63,7 @@
       <w:r>
         <w:t>I. THÔNG TIN CHUNG</w:t>
       </w:r>
-      <w:r>
-        <w:t xml:space="preserve"> (máy làm)</w:t>
-      </w:r>
+      <w:r/>
     </w:p>
     <w:p>
       <w:r>
@@ -162,7 +160,6 @@
           <w:sz w:val="26"/>
           <w:szCs w:val="26"/>
         </w:rPr>
-        <w:t xml:space="preserve"> (tôi làm)</w:t>
       </w:r>
     </w:p>
     <w:p>
@@ -232,7 +229,6 @@
           <w:sz w:val="26"/>
           <w:szCs w:val="26"/>
         </w:rPr>
-        <w:t xml:space="preserve"> (máy làm)</w:t>
       </w:r>
     </w:p>
     <w:p>
@@ -255,7 +251,7 @@
           <w:sz w:val="26"/>
           <w:szCs w:val="26"/>
         </w:rPr>
-        <w:t xml:space="preserve">Buổi 1: ngày + tên buổi học </w:t>
+        <w:t>Buổi 1: ngày + tên buổi học</w:t>
       </w:r>
     </w:p>
     <w:p>
@@ -305,7 +301,6 @@
           <w:sz w:val="26"/>
           <w:szCs w:val="26"/>
         </w:rPr>
-        <w:t>(máy làm)</w:t>
       </w:r>
     </w:p>
     <w:p>
@@ -328,7 +323,7 @@
           <w:sz w:val="26"/>
           <w:szCs w:val="26"/>
         </w:rPr>
-        <w:t xml:space="preserve">Buổi 1: ngày + tên buổi học </w:t>
+        <w:t>Buổi 1: ngày + tên buổi học</w:t>
       </w:r>
     </w:p>
     <w:p>
@@ -352,7 +347,6 @@
           <w:bCs w:val="0"/>
           <w:color w:val="000000"/>
         </w:rPr>
-        <w:t>(máy làm)</w:t>
       </w:r>
     </w:p>
     <w:p>
@@ -414,7 +408,6 @@
           <w:sz w:val="26"/>
           <w:szCs w:val="26"/>
         </w:rPr>
-        <w:t>(máy làm)</w:t>
       </w:r>
     </w:p>
     <w:tbl>
@@ -614,7 +607,6 @@
           <w:bCs w:val="0"/>
           <w:color w:val="000000"/>
         </w:rPr>
-        <w:t>(máy làm)</w:t>
       </w:r>
     </w:p>
     <w:p>
@@ -662,9 +654,7 @@
       <w:r>
         <w:t>V. KHÓ KHĂN / HỖ TRỢ CẦN THIẾT</w:t>
       </w:r>
-      <w:r>
-        <w:t xml:space="preserve"> (tôi làm)</w:t>
-      </w:r>
+      <w:r/>
     </w:p>
     <w:p>
       <w:pPr>
@@ -723,9 +713,7 @@
       <w:r>
         <w:t>VI. TỰ ĐÁNH GIÁ</w:t>
       </w:r>
-      <w:r>
-        <w:t xml:space="preserve"> (tôi làm)</w:t>
-      </w:r>
+      <w:r/>
     </w:p>
     <w:p>
       <w:r>
@@ -767,7 +755,6 @@
           <w:b/>
           <w:bCs/>
         </w:rPr>
-        <w:t xml:space="preserve">(máy làm) </w:t>
       </w:r>
       <w:r>
         <w:rPr>

</xml_diff>